<commit_message>
Restore the structure/electrical-control wording for periodic maintenance exemptions.
Keep the source phrases for simpler and more complex equipment instead of splitting structure and electrical control into separate conditions.

Co-authored-by: lyan29832 <lyan29832@gmail.com>
</commit_message>
<xml_diff>
--- a/设备预防性维护保养规程.docx
+++ b/设备预防性维护保养规程.docx
@@ -1055,7 +1055,7 @@
           <w:i w:val="0"/>
           <w:sz w:val="24"/>
         </w:rPr>
-        <w:t>（1）A类：通常情况下需要实施定期预防性维护保养。需校验的仪器设备，以及设备结构和电气控制相对简单的设备，可以不实施定期预防性维护保养。</w:t>
+        <w:t>（1）A类：通常情况下，需进行定期预防性维护保养。需校验的仪器设备、设备结构/电气控制相对较简单的设备可不做定期预防性维护保养。</w:t>
       </w:r>
     </w:p>
     <w:p>
@@ -1071,7 +1071,7 @@
           <w:i w:val="0"/>
           <w:sz w:val="24"/>
         </w:rPr>
-        <w:t>(1) Category A: periodic preventive maintenance is generally required. Instruments and equipment subject to calibration, and equipment with a relatively simple mechanical structure and electrical control system, need not undergo periodic preventive maintenance.</w:t>
+        <w:t>(1) Category A: in general, periodic preventive maintenance is required. Instruments and equipment subject to calibration, and equipment with a relatively simple structure/electrical control system, need not undergo periodic preventive maintenance.</w:t>
       </w:r>
     </w:p>
     <w:p>
@@ -1087,7 +1087,7 @@
           <w:i w:val="0"/>
           <w:sz w:val="24"/>
         </w:rPr>
-        <w:t>（2）B类：通常情况下不需要实施定期预防性维护保养。设备结构和电气控制相对复杂的设备，需要实施定期预防性维护保养。</w:t>
+        <w:t>（2）B类：通常情况下，不需进行定期预防性维护保养。设备结构/电气控制相对较复杂的设备需做定期预防性维护保养。</w:t>
       </w:r>
     </w:p>
     <w:p>
@@ -1103,7 +1103,7 @@
           <w:i w:val="0"/>
           <w:sz w:val="24"/>
         </w:rPr>
-        <w:t>(2) Category B: periodic preventive maintenance is generally not required. Equipment with a relatively complex mechanical structure and electrical control system shall undergo periodic preventive maintenance.</w:t>
+        <w:t>(2) Category B: in general, periodic preventive maintenance is not required. Equipment with a relatively complex structure/electrical control system shall undergo periodic preventive maintenance.</w:t>
       </w:r>
     </w:p>
     <w:p>

</xml_diff>

<commit_message>
Split the periodic-maintenance exemption into two readable conditions.
Keep calibration instruments and relatively simple structure/electrical-control equipment as separate cases that need not undergo periodic preventive maintenance.

Co-authored-by: lyan29832 <lyan29832@gmail.com>
</commit_message>
<xml_diff>
--- a/设备预防性维护保养规程.docx
+++ b/设备预防性维护保养规程.docx
@@ -1055,7 +1055,7 @@
           <w:i w:val="0"/>
           <w:sz w:val="24"/>
         </w:rPr>
-        <w:t>（1）A类：通常情况下，需进行定期预防性维护保养。需校验的仪器设备、设备结构/电气控制相对较简单的设备可不做定期预防性维护保养。</w:t>
+        <w:t>（1）A类：通常情况下，需进行定期预防性维护保养。下列设备可不做定期预防性维护保养：</w:t>
       </w:r>
     </w:p>
     <w:p>
@@ -1071,7 +1071,7 @@
           <w:i w:val="0"/>
           <w:sz w:val="24"/>
         </w:rPr>
-        <w:t>(1) Category A: in general, periodic preventive maintenance is required. Instruments and equipment subject to calibration, and equipment with a relatively simple structure/electrical control system, need not undergo periodic preventive maintenance.</w:t>
+        <w:t>(1) Category A: in general, periodic preventive maintenance is required. The following need not undergo periodic preventive maintenance:</w:t>
       </w:r>
     </w:p>
     <w:p>
@@ -1087,7 +1087,71 @@
           <w:i w:val="0"/>
           <w:sz w:val="24"/>
         </w:rPr>
-        <w:t>（2）B类：通常情况下，不需进行定期预防性维护保养。设备结构/电气控制相对较复杂的设备需做定期预防性维护保养。</w:t>
+        <w:t>① 需校验的仪器设备；</w:t>
+      </w:r>
+    </w:p>
+    <w:p>
+      <w:pPr>
+        <w:spacing w:before="0" w:after="40" w:lineRule="auto" w:line="240"/>
+        <w:ind w:firstLine="0" w:left="0"/>
+        <w:jc w:val="both"/>
+      </w:pPr>
+      <w:r>
+        <w:rPr>
+          <w:rFonts w:ascii="Arial" w:hAnsi="Arial" w:cs="Arial" w:eastAsia="宋体"/>
+          <w:b w:val="0"/>
+          <w:i w:val="0"/>
+          <w:sz w:val="24"/>
+        </w:rPr>
+        <w:t>a. instruments and equipment subject to calibration;</w:t>
+      </w:r>
+    </w:p>
+    <w:p>
+      <w:pPr>
+        <w:spacing w:before="0" w:after="20" w:lineRule="auto" w:line="240"/>
+        <w:ind w:firstLine="0" w:left="0"/>
+        <w:jc w:val="both"/>
+      </w:pPr>
+      <w:r>
+        <w:rPr>
+          <w:rFonts w:ascii="宋体" w:hAnsi="宋体" w:cs="宋体" w:eastAsia="宋体"/>
+          <w:b w:val="0"/>
+          <w:i w:val="0"/>
+          <w:sz w:val="24"/>
+        </w:rPr>
+        <w:t>② 设备结构/电气控制相对较简单的设备。</w:t>
+      </w:r>
+    </w:p>
+    <w:p>
+      <w:pPr>
+        <w:spacing w:before="0" w:after="40" w:lineRule="auto" w:line="240"/>
+        <w:ind w:firstLine="0" w:left="0"/>
+        <w:jc w:val="both"/>
+      </w:pPr>
+      <w:r>
+        <w:rPr>
+          <w:rFonts w:ascii="Arial" w:hAnsi="Arial" w:cs="Arial" w:eastAsia="宋体"/>
+          <w:b w:val="0"/>
+          <w:i w:val="0"/>
+          <w:sz w:val="24"/>
+        </w:rPr>
+        <w:t>b. equipment with a relatively simple structure/electrical control system.</w:t>
+      </w:r>
+    </w:p>
+    <w:p>
+      <w:pPr>
+        <w:spacing w:before="0" w:after="20" w:lineRule="auto" w:line="240"/>
+        <w:ind w:firstLine="0" w:left="0"/>
+        <w:jc w:val="both"/>
+      </w:pPr>
+      <w:r>
+        <w:rPr>
+          <w:rFonts w:ascii="宋体" w:hAnsi="宋体" w:cs="宋体" w:eastAsia="宋体"/>
+          <w:b w:val="0"/>
+          <w:i w:val="0"/>
+          <w:sz w:val="24"/>
+        </w:rPr>
+        <w:t>（2）B类：通常情况下，不需进行定期预防性维护保养。设备结构/电气控制相对较复杂的设备，需做定期预防性维护保养。</w:t>
       </w:r>
     </w:p>
     <w:p>

</xml_diff>

<commit_message>
Use the provided wording for the periodic maintenance exemption.
Keep the two source sentences for simpler and more complex structure/electrical-control equipment instead of splitting them into a new list.

Co-authored-by: lyan29832 <lyan29832@gmail.com>
</commit_message>
<xml_diff>
--- a/设备预防性维护保养规程.docx
+++ b/设备预防性维护保养规程.docx
@@ -1055,12 +1055,12 @@
           <w:i w:val="0"/>
           <w:sz w:val="24"/>
         </w:rPr>
-        <w:t>（1）A类：通常情况下，需进行定期预防性维护保养。下列设备可不做定期预防性维护保养：</w:t>
+        <w:t>（1）A类：通常情况下，需进行定期预防性维护保养。需校验的仪器设备、设备结构/电气控制相对较简单的设备可不做定期预防性维护保养。</w:t>
       </w:r>
     </w:p>
     <w:p>
       <w:pPr>
-        <w:spacing w:before="0" w:after="40" w:lineRule="auto" w:line="240"/>
+        <w:spacing w:before="0" w:after="160" w:lineRule="auto" w:line="240"/>
         <w:ind w:firstLine="0" w:left="0"/>
         <w:jc w:val="both"/>
       </w:pPr>
@@ -1071,7 +1071,7 @@
           <w:i w:val="0"/>
           <w:sz w:val="24"/>
         </w:rPr>
-        <w:t>(1) Category A: in general, periodic preventive maintenance is required. The following need not undergo periodic preventive maintenance:</w:t>
+        <w:t>(1) Category A: in general, periodic preventive maintenance is required. Instruments and equipment subject to calibration, and equipment with a relatively simple structure/electrical control system, need not undergo periodic preventive maintenance.</w:t>
       </w:r>
     </w:p>
     <w:p>
@@ -1087,71 +1087,7 @@
           <w:i w:val="0"/>
           <w:sz w:val="24"/>
         </w:rPr>
-        <w:t>① 需校验的仪器设备；</w:t>
-      </w:r>
-    </w:p>
-    <w:p>
-      <w:pPr>
-        <w:spacing w:before="0" w:after="40" w:lineRule="auto" w:line="240"/>
-        <w:ind w:firstLine="0" w:left="0"/>
-        <w:jc w:val="both"/>
-      </w:pPr>
-      <w:r>
-        <w:rPr>
-          <w:rFonts w:ascii="Arial" w:hAnsi="Arial" w:cs="Arial" w:eastAsia="宋体"/>
-          <w:b w:val="0"/>
-          <w:i w:val="0"/>
-          <w:sz w:val="24"/>
-        </w:rPr>
-        <w:t>a. instruments and equipment subject to calibration;</w:t>
-      </w:r>
-    </w:p>
-    <w:p>
-      <w:pPr>
-        <w:spacing w:before="0" w:after="20" w:lineRule="auto" w:line="240"/>
-        <w:ind w:firstLine="0" w:left="0"/>
-        <w:jc w:val="both"/>
-      </w:pPr>
-      <w:r>
-        <w:rPr>
-          <w:rFonts w:ascii="宋体" w:hAnsi="宋体" w:cs="宋体" w:eastAsia="宋体"/>
-          <w:b w:val="0"/>
-          <w:i w:val="0"/>
-          <w:sz w:val="24"/>
-        </w:rPr>
-        <w:t>② 设备结构/电气控制相对较简单的设备。</w:t>
-      </w:r>
-    </w:p>
-    <w:p>
-      <w:pPr>
-        <w:spacing w:before="0" w:after="40" w:lineRule="auto" w:line="240"/>
-        <w:ind w:firstLine="0" w:left="0"/>
-        <w:jc w:val="both"/>
-      </w:pPr>
-      <w:r>
-        <w:rPr>
-          <w:rFonts w:ascii="Arial" w:hAnsi="Arial" w:cs="Arial" w:eastAsia="宋体"/>
-          <w:b w:val="0"/>
-          <w:i w:val="0"/>
-          <w:sz w:val="24"/>
-        </w:rPr>
-        <w:t>b. equipment with a relatively simple structure/electrical control system.</w:t>
-      </w:r>
-    </w:p>
-    <w:p>
-      <w:pPr>
-        <w:spacing w:before="0" w:after="20" w:lineRule="auto" w:line="240"/>
-        <w:ind w:firstLine="0" w:left="0"/>
-        <w:jc w:val="both"/>
-      </w:pPr>
-      <w:r>
-        <w:rPr>
-          <w:rFonts w:ascii="宋体" w:hAnsi="宋体" w:cs="宋体" w:eastAsia="宋体"/>
-          <w:b w:val="0"/>
-          <w:i w:val="0"/>
-          <w:sz w:val="24"/>
-        </w:rPr>
-        <w:t>（2）B类：通常情况下，不需进行定期预防性维护保养。设备结构/电气控制相对较复杂的设备，需做定期预防性维护保养。</w:t>
+        <w:t>（2）B类：通常情况下，不需进行定期预防性维护保养。设备结构/电气控制相对较复杂的设备需做定期预防性维护保养。</w:t>
       </w:r>
     </w:p>
     <w:p>

</xml_diff>